<commit_message>
before rerun and will finish
</commit_message>
<xml_diff>
--- a/tables/table1_variable_construction.docx
+++ b/tables/table1_variable_construction.docx
@@ -47,7 +47,6 @@
           </w:tcPr>
           <w:p>
             <w:pPr>
-              <w:pStyle w:val="Normal"/>
               <w:jc w:val="left"/>
               <w:pBdr>
                 <w:bottom w:val="none" w:sz="0" w:space="0" w:color="000000"/>
@@ -100,7 +99,6 @@
           </w:tcPr>
           <w:p>
             <w:pPr>
-              <w:pStyle w:val="Normal"/>
               <w:jc w:val="left"/>
               <w:pBdr>
                 <w:bottom w:val="none" w:sz="0" w:space="0" w:color="000000"/>
@@ -153,7 +151,6 @@
           </w:tcPr>
           <w:p>
             <w:pPr>
-              <w:pStyle w:val="Normal"/>
               <w:jc w:val="left"/>
               <w:pBdr>
                 <w:bottom w:val="none" w:sz="0" w:space="0" w:color="000000"/>
@@ -206,7 +203,6 @@
           </w:tcPr>
           <w:p>
             <w:pPr>
-              <w:pStyle w:val="Normal"/>
               <w:jc w:val="left"/>
               <w:pBdr>
                 <w:bottom w:val="none" w:sz="0" w:space="0" w:color="000000"/>
@@ -265,7 +261,6 @@
           </w:tcPr>
           <w:p>
             <w:pPr>
-              <w:pStyle w:val="Normal"/>
               <w:jc w:val="left"/>
               <w:pBdr>
                 <w:bottom w:val="none" w:sz="0" w:space="0" w:color="000000"/>
@@ -318,7 +313,6 @@
           </w:tcPr>
           <w:p>
             <w:pPr>
-              <w:pStyle w:val="Normal"/>
               <w:jc w:val="left"/>
               <w:pBdr>
                 <w:bottom w:val="none" w:sz="0" w:space="0" w:color="000000"/>
@@ -384,7 +378,6 @@
           </w:tcPr>
           <w:p>
             <w:pPr>
-              <w:pStyle w:val="Normal"/>
               <w:jc w:val="left"/>
               <w:pBdr>
                 <w:bottom w:val="none" w:sz="0" w:space="0" w:color="000000"/>
@@ -437,27 +430,26 @@
           </w:tcPr>
           <w:p>
             <w:pPr>
-              <w:pStyle w:val="Normal"/>
-              <w:jc w:val="left"/>
-              <w:pBdr>
-                <w:bottom w:val="none" w:sz="0" w:space="0" w:color="000000"/>
-                <w:top w:val="none" w:sz="0" w:space="0" w:color="000000"/>
-                <w:left w:val="none" w:sz="0" w:space="0" w:color="000000"/>
-                <w:right w:val="none" w:sz="0" w:space="0" w:color="000000"/>
-              </w:pBdr>
-              <w:spacing w:after="100" w:before="100" w:line="240"/>
-              <w:ind w:left="100" w:right="100" w:firstLine="0" w:firstLineChars="0"/>
-              <w:rPr>
-                <w:rFonts w:ascii="Times" w:hAnsi="Times" w:eastAsia="Times" w:cs="Times"/>
-                <w:i w:val="false"/>
-                <w:b w:val="false"/>
-                <w:u w:val="none"/>
-                <w:sz w:val="22"/>
-                <w:szCs w:val="22"/>
-                <w:color w:val="000000"/>
-              </w:rPr>
-            </w:pPr>
-            <m:oMath xmlns:mml="http://www.w3.org/1998/Math/MathML"/>
+              <w:jc w:val="left"/>
+              <w:pBdr>
+                <w:bottom w:val="none" w:sz="0" w:space="0" w:color="000000"/>
+                <w:top w:val="none" w:sz="0" w:space="0" w:color="000000"/>
+                <w:left w:val="none" w:sz="0" w:space="0" w:color="000000"/>
+                <w:right w:val="none" w:sz="0" w:space="0" w:color="000000"/>
+              </w:pBdr>
+              <w:spacing w:after="100" w:before="100" w:line="240"/>
+              <w:ind w:left="100" w:right="100" w:firstLine="0" w:firstLineChars="0"/>
+              <w:rPr>
+                <w:rFonts w:ascii="Times" w:hAnsi="Times" w:eastAsia="Times" w:cs="Times"/>
+                <w:i w:val="false"/>
+                <w:b w:val="false"/>
+                <w:u w:val="none"/>
+                <w:sz w:val="22"/>
+                <w:szCs w:val="22"/>
+                <w:color w:val="000000"/>
+              </w:rPr>
+            </w:pPr>
+            NA
           </w:p>
         </w:tc>
       </w:tr>
@@ -485,7 +477,6 @@
           </w:tcPr>
           <w:p>
             <w:pPr>
-              <w:pStyle w:val="Normal"/>
               <w:jc w:val="left"/>
               <w:pBdr>
                 <w:bottom w:val="none" w:sz="0" w:space="0" w:color="000000"/>
@@ -538,7 +529,6 @@
           </w:tcPr>
           <w:p>
             <w:pPr>
-              <w:pStyle w:val="Normal"/>
               <w:jc w:val="left"/>
               <w:pBdr>
                 <w:bottom w:val="none" w:sz="0" w:space="0" w:color="000000"/>
@@ -591,7 +581,6 @@
           </w:tcPr>
           <w:p>
             <w:pPr>
-              <w:pStyle w:val="Normal"/>
               <w:jc w:val="left"/>
               <w:pBdr>
                 <w:bottom w:val="none" w:sz="0" w:space="0" w:color="000000"/>
@@ -644,27 +633,26 @@
           </w:tcPr>
           <w:p>
             <w:pPr>
-              <w:pStyle w:val="Normal"/>
-              <w:jc w:val="left"/>
-              <w:pBdr>
-                <w:bottom w:val="none" w:sz="0" w:space="0" w:color="000000"/>
-                <w:top w:val="none" w:sz="0" w:space="0" w:color="000000"/>
-                <w:left w:val="none" w:sz="0" w:space="0" w:color="000000"/>
-                <w:right w:val="none" w:sz="0" w:space="0" w:color="000000"/>
-              </w:pBdr>
-              <w:spacing w:after="100" w:before="100" w:line="240"/>
-              <w:ind w:left="100" w:right="100" w:firstLine="0" w:firstLineChars="0"/>
-              <w:rPr>
-                <w:rFonts w:ascii="Times" w:hAnsi="Times" w:eastAsia="Times" w:cs="Times"/>
-                <w:i w:val="false"/>
-                <w:b w:val="false"/>
-                <w:u w:val="none"/>
-                <w:sz w:val="22"/>
-                <w:szCs w:val="22"/>
-                <w:color w:val="000000"/>
-              </w:rPr>
-            </w:pPr>
-            <m:oMath xmlns:mml="http://www.w3.org/1998/Math/MathML"/>
+              <w:jc w:val="left"/>
+              <w:pBdr>
+                <w:bottom w:val="none" w:sz="0" w:space="0" w:color="000000"/>
+                <w:top w:val="none" w:sz="0" w:space="0" w:color="000000"/>
+                <w:left w:val="none" w:sz="0" w:space="0" w:color="000000"/>
+                <w:right w:val="none" w:sz="0" w:space="0" w:color="000000"/>
+              </w:pBdr>
+              <w:spacing w:after="100" w:before="100" w:line="240"/>
+              <w:ind w:left="100" w:right="100" w:firstLine="0" w:firstLineChars="0"/>
+              <w:rPr>
+                <w:rFonts w:ascii="Times" w:hAnsi="Times" w:eastAsia="Times" w:cs="Times"/>
+                <w:i w:val="false"/>
+                <w:b w:val="false"/>
+                <w:u w:val="none"/>
+                <w:sz w:val="22"/>
+                <w:szCs w:val="22"/>
+                <w:color w:val="000000"/>
+              </w:rPr>
+            </w:pPr>
+            NA
           </w:p>
         </w:tc>
       </w:tr>
@@ -692,7 +680,6 @@
           </w:tcPr>
           <w:p>
             <w:pPr>
-              <w:pStyle w:val="Normal"/>
               <w:jc w:val="left"/>
               <w:pBdr>
                 <w:bottom w:val="none" w:sz="0" w:space="0" w:color="000000"/>
@@ -745,7 +732,6 @@
           </w:tcPr>
           <w:p>
             <w:pPr>
-              <w:pStyle w:val="Normal"/>
               <w:jc w:val="left"/>
               <w:pBdr>
                 <w:bottom w:val="none" w:sz="0" w:space="0" w:color="000000"/>
@@ -798,7 +784,6 @@
           </w:tcPr>
           <w:p>
             <w:pPr>
-              <w:pStyle w:val="Normal"/>
               <w:jc w:val="left"/>
               <w:pBdr>
                 <w:bottom w:val="none" w:sz="0" w:space="0" w:color="000000"/>
@@ -851,27 +836,26 @@
           </w:tcPr>
           <w:p>
             <w:pPr>
-              <w:pStyle w:val="Normal"/>
-              <w:jc w:val="left"/>
-              <w:pBdr>
-                <w:bottom w:val="none" w:sz="0" w:space="0" w:color="000000"/>
-                <w:top w:val="none" w:sz="0" w:space="0" w:color="000000"/>
-                <w:left w:val="none" w:sz="0" w:space="0" w:color="000000"/>
-                <w:right w:val="none" w:sz="0" w:space="0" w:color="000000"/>
-              </w:pBdr>
-              <w:spacing w:after="100" w:before="100" w:line="240"/>
-              <w:ind w:left="100" w:right="100" w:firstLine="0" w:firstLineChars="0"/>
-              <w:rPr>
-                <w:rFonts w:ascii="Times" w:hAnsi="Times" w:eastAsia="Times" w:cs="Times"/>
-                <w:i w:val="false"/>
-                <w:b w:val="false"/>
-                <w:u w:val="none"/>
-                <w:sz w:val="22"/>
-                <w:szCs w:val="22"/>
-                <w:color w:val="000000"/>
-              </w:rPr>
-            </w:pPr>
-            <m:oMath xmlns:mml="http://www.w3.org/1998/Math/MathML"/>
+              <w:jc w:val="left"/>
+              <w:pBdr>
+                <w:bottom w:val="none" w:sz="0" w:space="0" w:color="000000"/>
+                <w:top w:val="none" w:sz="0" w:space="0" w:color="000000"/>
+                <w:left w:val="none" w:sz="0" w:space="0" w:color="000000"/>
+                <w:right w:val="none" w:sz="0" w:space="0" w:color="000000"/>
+              </w:pBdr>
+              <w:spacing w:after="100" w:before="100" w:line="240"/>
+              <w:ind w:left="100" w:right="100" w:firstLine="0" w:firstLineChars="0"/>
+              <w:rPr>
+                <w:rFonts w:ascii="Times" w:hAnsi="Times" w:eastAsia="Times" w:cs="Times"/>
+                <w:i w:val="false"/>
+                <w:b w:val="false"/>
+                <w:u w:val="none"/>
+                <w:sz w:val="22"/>
+                <w:szCs w:val="22"/>
+                <w:color w:val="000000"/>
+              </w:rPr>
+            </w:pPr>
+            NA
           </w:p>
         </w:tc>
       </w:tr>
@@ -899,7 +883,6 @@
           </w:tcPr>
           <w:p>
             <w:pPr>
-              <w:pStyle w:val="Normal"/>
               <w:jc w:val="left"/>
               <w:pBdr>
                 <w:bottom w:val="none" w:sz="0" w:space="0" w:color="000000"/>
@@ -952,7 +935,6 @@
           </w:tcPr>
           <w:p>
             <w:pPr>
-              <w:pStyle w:val="Normal"/>
               <w:jc w:val="left"/>
               <w:pBdr>
                 <w:bottom w:val="none" w:sz="0" w:space="0" w:color="000000"/>
@@ -1005,7 +987,6 @@
           </w:tcPr>
           <w:p>
             <w:pPr>
-              <w:pStyle w:val="Normal"/>
               <w:jc w:val="left"/>
               <w:pBdr>
                 <w:bottom w:val="none" w:sz="0" w:space="0" w:color="000000"/>
@@ -1058,64 +1039,26 @@
           </w:tcPr>
           <w:p>
             <w:pPr>
-              <w:pStyle w:val="Normal"/>
-              <w:jc w:val="left"/>
-              <w:pBdr>
-                <w:bottom w:val="none" w:sz="0" w:space="0" w:color="000000"/>
-                <w:top w:val="none" w:sz="0" w:space="0" w:color="000000"/>
-                <w:left w:val="none" w:sz="0" w:space="0" w:color="000000"/>
-                <w:right w:val="none" w:sz="0" w:space="0" w:color="000000"/>
-              </w:pBdr>
-              <w:spacing w:after="100" w:before="100" w:line="240"/>
-              <w:ind w:left="100" w:right="100" w:firstLine="0" w:firstLineChars="0"/>
-              <w:rPr>
-                <w:rFonts w:ascii="Times" w:hAnsi="Times" w:eastAsia="Times" w:cs="Times"/>
-                <w:i w:val="false"/>
-                <w:b w:val="false"/>
-                <w:u w:val="none"/>
-                <w:sz w:val="22"/>
-                <w:szCs w:val="22"/>
-                <w:color w:val="000000"/>
-              </w:rPr>
-            </w:pPr>
-            <m:oMath xmlns:mml="http://www.w3.org/1998/Math/MathML">
-              <m:limLow>
-                <m:e>
-                  <m:r>
-                    <m:rPr>
-                      <m:sty m:val="p"/>
-                    </m:rPr>
-                    <m:t>min</m:t>
-                  </m:r>
-                  <m:r>
-                    <m:t>⁡</m:t>
-                  </m:r>
-                </m:e>
-                <m:lim>
-                  <m:r>
-                    <m:t>i</m:t>
-                  </m:r>
-                </m:lim>
-              </m:limLow>
-              <m:r>
-                <m:t>(</m:t>
-              </m:r>
-              <m:sSub>
-                <m:e>
-                  <m:r>
-                    <m:t>a</m:t>
-                  </m:r>
-                </m:e>
-                <m:sub>
-                  <m:r>
-                    <m:t>i</m:t>
-                  </m:r>
-                </m:sub>
-              </m:sSub>
-              <m:r>
-                <m:t>)</m:t>
-              </m:r>
-            </m:oMath>
+              <w:jc w:val="left"/>
+              <w:pBdr>
+                <w:bottom w:val="none" w:sz="0" w:space="0" w:color="000000"/>
+                <w:top w:val="none" w:sz="0" w:space="0" w:color="000000"/>
+                <w:left w:val="none" w:sz="0" w:space="0" w:color="000000"/>
+                <w:right w:val="none" w:sz="0" w:space="0" w:color="000000"/>
+              </w:pBdr>
+              <w:spacing w:after="100" w:before="100" w:line="240"/>
+              <w:ind w:left="100" w:right="100" w:firstLine="0" w:firstLineChars="0"/>
+              <w:rPr>
+                <w:rFonts w:ascii="Times" w:hAnsi="Times" w:eastAsia="Times" w:cs="Times"/>
+                <w:i w:val="false"/>
+                <w:b w:val="false"/>
+                <w:u w:val="none"/>
+                <w:sz w:val="22"/>
+                <w:szCs w:val="22"/>
+                <w:color w:val="000000"/>
+              </w:rPr>
+            </w:pPr>
+            NA
           </w:p>
         </w:tc>
       </w:tr>
@@ -1143,7 +1086,6 @@
           </w:tcPr>
           <w:p>
             <w:pPr>
-              <w:pStyle w:val="Normal"/>
               <w:jc w:val="left"/>
               <w:pBdr>
                 <w:bottom w:val="none" w:sz="0" w:space="0" w:color="000000"/>
@@ -1196,7 +1138,6 @@
           </w:tcPr>
           <w:p>
             <w:pPr>
-              <w:pStyle w:val="Normal"/>
               <w:jc w:val="left"/>
               <w:pBdr>
                 <w:bottom w:val="none" w:sz="0" w:space="0" w:color="000000"/>
@@ -1249,7 +1190,6 @@
           </w:tcPr>
           <w:p>
             <w:pPr>
-              <w:pStyle w:val="Normal"/>
               <w:jc w:val="left"/>
               <w:pBdr>
                 <w:bottom w:val="none" w:sz="0" w:space="0" w:color="000000"/>
@@ -1302,27 +1242,26 @@
           </w:tcPr>
           <w:p>
             <w:pPr>
-              <w:pStyle w:val="Normal"/>
-              <w:jc w:val="left"/>
-              <w:pBdr>
-                <w:bottom w:val="none" w:sz="0" w:space="0" w:color="000000"/>
-                <w:top w:val="none" w:sz="0" w:space="0" w:color="000000"/>
-                <w:left w:val="none" w:sz="0" w:space="0" w:color="000000"/>
-                <w:right w:val="none" w:sz="0" w:space="0" w:color="000000"/>
-              </w:pBdr>
-              <w:spacing w:after="100" w:before="100" w:line="240"/>
-              <w:ind w:left="100" w:right="100" w:firstLine="0" w:firstLineChars="0"/>
-              <w:rPr>
-                <w:rFonts w:ascii="Times" w:hAnsi="Times" w:eastAsia="Times" w:cs="Times"/>
-                <w:i w:val="false"/>
-                <w:b w:val="false"/>
-                <w:u w:val="none"/>
-                <w:sz w:val="22"/>
-                <w:szCs w:val="22"/>
-                <w:color w:val="000000"/>
-              </w:rPr>
-            </w:pPr>
-            <m:oMath xmlns:mml="http://www.w3.org/1998/Math/MathML"/>
+              <w:jc w:val="left"/>
+              <w:pBdr>
+                <w:bottom w:val="none" w:sz="0" w:space="0" w:color="000000"/>
+                <w:top w:val="none" w:sz="0" w:space="0" w:color="000000"/>
+                <w:left w:val="none" w:sz="0" w:space="0" w:color="000000"/>
+                <w:right w:val="none" w:sz="0" w:space="0" w:color="000000"/>
+              </w:pBdr>
+              <w:spacing w:after="100" w:before="100" w:line="240"/>
+              <w:ind w:left="100" w:right="100" w:firstLine="0" w:firstLineChars="0"/>
+              <w:rPr>
+                <w:rFonts w:ascii="Times" w:hAnsi="Times" w:eastAsia="Times" w:cs="Times"/>
+                <w:i w:val="false"/>
+                <w:b w:val="false"/>
+                <w:u w:val="none"/>
+                <w:sz w:val="22"/>
+                <w:szCs w:val="22"/>
+                <w:color w:val="000000"/>
+              </w:rPr>
+            </w:pPr>
+            NA
           </w:p>
         </w:tc>
       </w:tr>
@@ -1350,7 +1289,6 @@
           </w:tcPr>
           <w:p>
             <w:pPr>
-              <w:pStyle w:val="Normal"/>
               <w:jc w:val="left"/>
               <w:pBdr>
                 <w:bottom w:val="none" w:sz="0" w:space="0" w:color="000000"/>
@@ -1403,7 +1341,6 @@
           </w:tcPr>
           <w:p>
             <w:pPr>
-              <w:pStyle w:val="Normal"/>
               <w:jc w:val="left"/>
               <w:pBdr>
                 <w:bottom w:val="none" w:sz="0" w:space="0" w:color="000000"/>
@@ -1456,7 +1393,6 @@
           </w:tcPr>
           <w:p>
             <w:pPr>
-              <w:pStyle w:val="Normal"/>
               <w:jc w:val="left"/>
               <w:pBdr>
                 <w:bottom w:val="none" w:sz="0" w:space="0" w:color="000000"/>
@@ -1509,27 +1445,26 @@
           </w:tcPr>
           <w:p>
             <w:pPr>
-              <w:pStyle w:val="Normal"/>
-              <w:jc w:val="left"/>
-              <w:pBdr>
-                <w:bottom w:val="none" w:sz="0" w:space="0" w:color="000000"/>
-                <w:top w:val="none" w:sz="0" w:space="0" w:color="000000"/>
-                <w:left w:val="none" w:sz="0" w:space="0" w:color="000000"/>
-                <w:right w:val="none" w:sz="0" w:space="0" w:color="000000"/>
-              </w:pBdr>
-              <w:spacing w:after="100" w:before="100" w:line="240"/>
-              <w:ind w:left="100" w:right="100" w:firstLine="0" w:firstLineChars="0"/>
-              <w:rPr>
-                <w:rFonts w:ascii="Times" w:hAnsi="Times" w:eastAsia="Times" w:cs="Times"/>
-                <w:i w:val="false"/>
-                <w:b w:val="false"/>
-                <w:u w:val="none"/>
-                <w:sz w:val="22"/>
-                <w:szCs w:val="22"/>
-                <w:color w:val="000000"/>
-              </w:rPr>
-            </w:pPr>
-            <m:oMath xmlns:mml="http://www.w3.org/1998/Math/MathML"/>
+              <w:jc w:val="left"/>
+              <w:pBdr>
+                <w:bottom w:val="none" w:sz="0" w:space="0" w:color="000000"/>
+                <w:top w:val="none" w:sz="0" w:space="0" w:color="000000"/>
+                <w:left w:val="none" w:sz="0" w:space="0" w:color="000000"/>
+                <w:right w:val="none" w:sz="0" w:space="0" w:color="000000"/>
+              </w:pBdr>
+              <w:spacing w:after="100" w:before="100" w:line="240"/>
+              <w:ind w:left="100" w:right="100" w:firstLine="0" w:firstLineChars="0"/>
+              <w:rPr>
+                <w:rFonts w:ascii="Times" w:hAnsi="Times" w:eastAsia="Times" w:cs="Times"/>
+                <w:i w:val="false"/>
+                <w:b w:val="false"/>
+                <w:u w:val="none"/>
+                <w:sz w:val="22"/>
+                <w:szCs w:val="22"/>
+                <w:color w:val="000000"/>
+              </w:rPr>
+            </w:pPr>
+            NA
           </w:p>
         </w:tc>
       </w:tr>
@@ -1557,7 +1492,6 @@
           </w:tcPr>
           <w:p>
             <w:pPr>
-              <w:pStyle w:val="Normal"/>
               <w:jc w:val="left"/>
               <w:pBdr>
                 <w:bottom w:val="none" w:sz="0" w:space="0" w:color="000000"/>
@@ -1610,7 +1544,6 @@
           </w:tcPr>
           <w:p>
             <w:pPr>
-              <w:pStyle w:val="Normal"/>
               <w:jc w:val="left"/>
               <w:pBdr>
                 <w:bottom w:val="none" w:sz="0" w:space="0" w:color="000000"/>
@@ -1663,7 +1596,6 @@
           </w:tcPr>
           <w:p>
             <w:pPr>
-              <w:pStyle w:val="Normal"/>
               <w:jc w:val="left"/>
               <w:pBdr>
                 <w:bottom w:val="none" w:sz="0" w:space="0" w:color="000000"/>
@@ -1716,27 +1648,26 @@
           </w:tcPr>
           <w:p>
             <w:pPr>
-              <w:pStyle w:val="Normal"/>
-              <w:jc w:val="left"/>
-              <w:pBdr>
-                <w:bottom w:val="none" w:sz="0" w:space="0" w:color="000000"/>
-                <w:top w:val="none" w:sz="0" w:space="0" w:color="000000"/>
-                <w:left w:val="none" w:sz="0" w:space="0" w:color="000000"/>
-                <w:right w:val="none" w:sz="0" w:space="0" w:color="000000"/>
-              </w:pBdr>
-              <w:spacing w:after="100" w:before="100" w:line="240"/>
-              <w:ind w:left="100" w:right="100" w:firstLine="0" w:firstLineChars="0"/>
-              <w:rPr>
-                <w:rFonts w:ascii="Times" w:hAnsi="Times" w:eastAsia="Times" w:cs="Times"/>
-                <w:i w:val="false"/>
-                <w:b w:val="false"/>
-                <w:u w:val="none"/>
-                <w:sz w:val="22"/>
-                <w:szCs w:val="22"/>
-                <w:color w:val="000000"/>
-              </w:rPr>
-            </w:pPr>
-            <m:oMath xmlns:mml="http://www.w3.org/1998/Math/MathML"/>
+              <w:jc w:val="left"/>
+              <w:pBdr>
+                <w:bottom w:val="none" w:sz="0" w:space="0" w:color="000000"/>
+                <w:top w:val="none" w:sz="0" w:space="0" w:color="000000"/>
+                <w:left w:val="none" w:sz="0" w:space="0" w:color="000000"/>
+                <w:right w:val="none" w:sz="0" w:space="0" w:color="000000"/>
+              </w:pBdr>
+              <w:spacing w:after="100" w:before="100" w:line="240"/>
+              <w:ind w:left="100" w:right="100" w:firstLine="0" w:firstLineChars="0"/>
+              <w:rPr>
+                <w:rFonts w:ascii="Times" w:hAnsi="Times" w:eastAsia="Times" w:cs="Times"/>
+                <w:i w:val="false"/>
+                <w:b w:val="false"/>
+                <w:u w:val="none"/>
+                <w:sz w:val="22"/>
+                <w:szCs w:val="22"/>
+                <w:color w:val="000000"/>
+              </w:rPr>
+            </w:pPr>
+            NA
           </w:p>
         </w:tc>
       </w:tr>
@@ -1764,7 +1695,6 @@
           </w:tcPr>
           <w:p>
             <w:pPr>
-              <w:pStyle w:val="Normal"/>
               <w:jc w:val="left"/>
               <w:pBdr>
                 <w:bottom w:val="none" w:sz="0" w:space="0" w:color="000000"/>
@@ -1817,7 +1747,6 @@
           </w:tcPr>
           <w:p>
             <w:pPr>
-              <w:pStyle w:val="Normal"/>
               <w:jc w:val="left"/>
               <w:pBdr>
                 <w:bottom w:val="none" w:sz="0" w:space="0" w:color="000000"/>
@@ -1870,7 +1799,6 @@
           </w:tcPr>
           <w:p>
             <w:pPr>
-              <w:pStyle w:val="Normal"/>
               <w:jc w:val="left"/>
               <w:pBdr>
                 <w:bottom w:val="none" w:sz="0" w:space="0" w:color="000000"/>
@@ -1923,27 +1851,26 @@
           </w:tcPr>
           <w:p>
             <w:pPr>
-              <w:pStyle w:val="Normal"/>
-              <w:jc w:val="left"/>
-              <w:pBdr>
-                <w:bottom w:val="none" w:sz="0" w:space="0" w:color="000000"/>
-                <w:top w:val="none" w:sz="0" w:space="0" w:color="000000"/>
-                <w:left w:val="none" w:sz="0" w:space="0" w:color="000000"/>
-                <w:right w:val="none" w:sz="0" w:space="0" w:color="000000"/>
-              </w:pBdr>
-              <w:spacing w:after="100" w:before="100" w:line="240"/>
-              <w:ind w:left="100" w:right="100" w:firstLine="0" w:firstLineChars="0"/>
-              <w:rPr>
-                <w:rFonts w:ascii="Times" w:hAnsi="Times" w:eastAsia="Times" w:cs="Times"/>
-                <w:i w:val="false"/>
-                <w:b w:val="false"/>
-                <w:u w:val="none"/>
-                <w:sz w:val="22"/>
-                <w:szCs w:val="22"/>
-                <w:color w:val="000000"/>
-              </w:rPr>
-            </w:pPr>
-            <m:oMath xmlns:mml="http://www.w3.org/1998/Math/MathML"/>
+              <w:jc w:val="left"/>
+              <w:pBdr>
+                <w:bottom w:val="none" w:sz="0" w:space="0" w:color="000000"/>
+                <w:top w:val="none" w:sz="0" w:space="0" w:color="000000"/>
+                <w:left w:val="none" w:sz="0" w:space="0" w:color="000000"/>
+                <w:right w:val="none" w:sz="0" w:space="0" w:color="000000"/>
+              </w:pBdr>
+              <w:spacing w:after="100" w:before="100" w:line="240"/>
+              <w:ind w:left="100" w:right="100" w:firstLine="0" w:firstLineChars="0"/>
+              <w:rPr>
+                <w:rFonts w:ascii="Times" w:hAnsi="Times" w:eastAsia="Times" w:cs="Times"/>
+                <w:i w:val="false"/>
+                <w:b w:val="false"/>
+                <w:u w:val="none"/>
+                <w:sz w:val="22"/>
+                <w:szCs w:val="22"/>
+                <w:color w:val="000000"/>
+              </w:rPr>
+            </w:pPr>
+            NA
           </w:p>
         </w:tc>
       </w:tr>
@@ -1971,7 +1898,6 @@
           </w:tcPr>
           <w:p>
             <w:pPr>
-              <w:pStyle w:val="Normal"/>
               <w:jc w:val="left"/>
               <w:pBdr>
                 <w:bottom w:val="none" w:sz="0" w:space="0" w:color="000000"/>
@@ -2024,7 +1950,6 @@
           </w:tcPr>
           <w:p>
             <w:pPr>
-              <w:pStyle w:val="Normal"/>
               <w:jc w:val="left"/>
               <w:pBdr>
                 <w:bottom w:val="none" w:sz="0" w:space="0" w:color="000000"/>
@@ -2077,7 +2002,6 @@
           </w:tcPr>
           <w:p>
             <w:pPr>
-              <w:pStyle w:val="Normal"/>
               <w:jc w:val="left"/>
               <w:pBdr>
                 <w:bottom w:val="none" w:sz="0" w:space="0" w:color="000000"/>
@@ -2130,76 +2054,26 @@
           </w:tcPr>
           <w:p>
             <w:pPr>
-              <w:pStyle w:val="Normal"/>
-              <w:jc w:val="left"/>
-              <w:pBdr>
-                <w:bottom w:val="none" w:sz="0" w:space="0" w:color="000000"/>
-                <w:top w:val="none" w:sz="0" w:space="0" w:color="000000"/>
-                <w:left w:val="none" w:sz="0" w:space="0" w:color="000000"/>
-                <w:right w:val="none" w:sz="0" w:space="0" w:color="000000"/>
-              </w:pBdr>
-              <w:spacing w:after="100" w:before="100" w:line="240"/>
-              <w:ind w:left="100" w:right="100" w:firstLine="0" w:firstLineChars="0"/>
-              <w:rPr>
-                <w:rFonts w:ascii="Times" w:hAnsi="Times" w:eastAsia="Times" w:cs="Times"/>
-                <w:i w:val="false"/>
-                <w:b w:val="false"/>
-                <w:u w:val="none"/>
-                <w:sz w:val="22"/>
-                <w:szCs w:val="22"/>
-                <w:color w:val="000000"/>
-              </w:rPr>
-            </w:pPr>
-            <m:oMath xmlns:mml="http://www.w3.org/1998/Math/MathML">
-              <m:f>
-                <m:fPr>
-                  <m:type m:val="bar"/>
-                </m:fPr>
-                <m:num>
-                  <m:r>
-                    <m:t>1</m:t>
-                  </m:r>
-                </m:num>
-                <m:den>
-                  <m:r>
-                    <m:t>2</m:t>
-                  </m:r>
-                </m:den>
-              </m:f>
-              <m:r>
-                <m:t>(</m:t>
-              </m:r>
-              <m:sSub>
-                <m:e>
-                  <m:r>
-                    <m:t>d</m:t>
-                  </m:r>
-                </m:e>
-                <m:sub>
-                  <m:r>
-                    <m:t>1</m:t>
-                  </m:r>
-                </m:sub>
-              </m:sSub>
-              <m:r>
-                <m:t>+</m:t>
-              </m:r>
-              <m:sSub>
-                <m:e>
-                  <m:r>
-                    <m:t>d</m:t>
-                  </m:r>
-                </m:e>
-                <m:sub>
-                  <m:r>
-                    <m:t>2</m:t>
-                  </m:r>
-                </m:sub>
-              </m:sSub>
-              <m:r>
-                <m:t>)</m:t>
-              </m:r>
-            </m:oMath>
+              <w:jc w:val="left"/>
+              <w:pBdr>
+                <w:bottom w:val="none" w:sz="0" w:space="0" w:color="000000"/>
+                <w:top w:val="none" w:sz="0" w:space="0" w:color="000000"/>
+                <w:left w:val="none" w:sz="0" w:space="0" w:color="000000"/>
+                <w:right w:val="none" w:sz="0" w:space="0" w:color="000000"/>
+              </w:pBdr>
+              <w:spacing w:after="100" w:before="100" w:line="240"/>
+              <w:ind w:left="100" w:right="100" w:firstLine="0" w:firstLineChars="0"/>
+              <w:rPr>
+                <w:rFonts w:ascii="Times" w:hAnsi="Times" w:eastAsia="Times" w:cs="Times"/>
+                <w:i w:val="false"/>
+                <w:b w:val="false"/>
+                <w:u w:val="none"/>
+                <w:sz w:val="22"/>
+                <w:szCs w:val="22"/>
+                <w:color w:val="000000"/>
+              </w:rPr>
+            </w:pPr>
+            NA
           </w:p>
         </w:tc>
       </w:tr>
@@ -2227,7 +2101,6 @@
           </w:tcPr>
           <w:p>
             <w:pPr>
-              <w:pStyle w:val="Normal"/>
               <w:jc w:val="left"/>
               <w:pBdr>
                 <w:bottom w:val="none" w:sz="0" w:space="0" w:color="000000"/>
@@ -2280,7 +2153,6 @@
           </w:tcPr>
           <w:p>
             <w:pPr>
-              <w:pStyle w:val="Normal"/>
               <w:jc w:val="left"/>
               <w:pBdr>
                 <w:bottom w:val="none" w:sz="0" w:space="0" w:color="000000"/>
@@ -2333,7 +2205,6 @@
           </w:tcPr>
           <w:p>
             <w:pPr>
-              <w:pStyle w:val="Normal"/>
               <w:jc w:val="left"/>
               <w:pBdr>
                 <w:bottom w:val="none" w:sz="0" w:space="0" w:color="000000"/>
@@ -2386,27 +2257,26 @@
           </w:tcPr>
           <w:p>
             <w:pPr>
-              <w:pStyle w:val="Normal"/>
-              <w:jc w:val="left"/>
-              <w:pBdr>
-                <w:bottom w:val="none" w:sz="0" w:space="0" w:color="000000"/>
-                <w:top w:val="none" w:sz="0" w:space="0" w:color="000000"/>
-                <w:left w:val="none" w:sz="0" w:space="0" w:color="000000"/>
-                <w:right w:val="none" w:sz="0" w:space="0" w:color="000000"/>
-              </w:pBdr>
-              <w:spacing w:after="100" w:before="100" w:line="240"/>
-              <w:ind w:left="100" w:right="100" w:firstLine="0" w:firstLineChars="0"/>
-              <w:rPr>
-                <w:rFonts w:ascii="Times" w:hAnsi="Times" w:eastAsia="Times" w:cs="Times"/>
-                <w:i w:val="false"/>
-                <w:b w:val="false"/>
-                <w:u w:val="none"/>
-                <w:sz w:val="22"/>
-                <w:szCs w:val="22"/>
-                <w:color w:val="000000"/>
-              </w:rPr>
-            </w:pPr>
-            <m:oMath xmlns:mml="http://www.w3.org/1998/Math/MathML"/>
+              <w:jc w:val="left"/>
+              <w:pBdr>
+                <w:bottom w:val="none" w:sz="0" w:space="0" w:color="000000"/>
+                <w:top w:val="none" w:sz="0" w:space="0" w:color="000000"/>
+                <w:left w:val="none" w:sz="0" w:space="0" w:color="000000"/>
+                <w:right w:val="none" w:sz="0" w:space="0" w:color="000000"/>
+              </w:pBdr>
+              <w:spacing w:after="100" w:before="100" w:line="240"/>
+              <w:ind w:left="100" w:right="100" w:firstLine="0" w:firstLineChars="0"/>
+              <w:rPr>
+                <w:rFonts w:ascii="Times" w:hAnsi="Times" w:eastAsia="Times" w:cs="Times"/>
+                <w:i w:val="false"/>
+                <w:b w:val="false"/>
+                <w:u w:val="none"/>
+                <w:sz w:val="22"/>
+                <w:szCs w:val="22"/>
+                <w:color w:val="000000"/>
+              </w:rPr>
+            </w:pPr>
+            NA
           </w:p>
         </w:tc>
       </w:tr>
@@ -2435,7 +2305,6 @@
           </w:tcPr>
           <w:p>
             <w:pPr>
-              <w:pStyle w:val="Normal"/>
               <w:jc w:val="left"/>
               <w:pBdr>
                 <w:bottom w:val="none" w:sz="0" w:space="0" w:color="000000"/>
@@ -2484,9 +2353,9 @@
         </w:tc>
       </w:tr>
     </w:tbl>
-    <w:sectPr w:officer="true">
-      <w:pgMar w:header="720" w:bottom="1440" w:top="1440" w:right="1440" w:left="1440" w:footer="720" w:gutter="720"/>
-      <w:pgSz w:h="16848" w:w="11952" w:orient="portrait"/>
+    <w:sectPr>
+      <w:pgMar w:header="708" w:bottom="1417" w:top="1417" w:right="1417" w:left="1417" w:footer="708" w:gutter="0"/>
+      <w:pgSz w:h="16838" w:w="11906" w:orient="portrait"/>
       <w:type w:val="continuous"/>
       <w:cols/>
     </w:sectPr>

</xml_diff>